<commit_message>
Home Page data update done - 15/07/26
</commit_message>
<xml_diff>
--- a/public/SOUL IT NETWORKS LLP.docx
+++ b/public/SOUL IT NETWORKS LLP.docx
@@ -3082,6 +3082,81 @@
         </w:rPr>
         <w:t>8. Core Technology Practices</w:t>
       </w:r>
+      <w:r>
+        <w:rPr>
+          <w:rFonts w:ascii="Times New Roman" w:eastAsia="Times New Roman" w:hAnsi="Times New Roman" w:cs="Times New Roman"/>
+          <w:b/>
+          <w:bCs/>
+          <w:kern w:val="36"/>
+          <w:sz w:val="48"/>
+          <w:szCs w:val="48"/>
+          <w:lang w:eastAsia="en-IN"/>
+        </w:rPr>
+        <w:t xml:space="preserve"> </w:t>
+      </w:r>
+      <w:r>
+        <w:rPr>
+          <w:rFonts w:ascii="Times New Roman" w:eastAsia="Times New Roman" w:hAnsi="Times New Roman" w:cs="Times New Roman"/>
+          <w:b/>
+          <w:bCs/>
+          <w:kern w:val="36"/>
+          <w:sz w:val="48"/>
+          <w:szCs w:val="48"/>
+          <w:lang w:eastAsia="en-IN"/>
+        </w:rPr>
+        <w:sym w:font="Wingdings" w:char="F0E0"/>
+      </w:r>
+      <w:r>
+        <w:rPr>
+          <w:rFonts w:ascii="Times New Roman" w:eastAsia="Times New Roman" w:hAnsi="Times New Roman" w:cs="Times New Roman"/>
+          <w:b/>
+          <w:bCs/>
+          <w:kern w:val="36"/>
+          <w:sz w:val="48"/>
+          <w:szCs w:val="48"/>
+          <w:lang w:eastAsia="en-IN"/>
+        </w:rPr>
+        <w:t xml:space="preserve"> </w:t>
+      </w:r>
+      <w:r>
+        <w:rPr>
+          <w:rFonts w:ascii="Times New Roman" w:eastAsia="Times New Roman" w:hAnsi="Times New Roman" w:cs="Times New Roman"/>
+          <w:b/>
+          <w:bCs/>
+          <w:kern w:val="36"/>
+          <w:sz w:val="48"/>
+          <w:szCs w:val="48"/>
+          <w:highlight w:val="yellow"/>
+          <w:lang w:eastAsia="en-IN"/>
+        </w:rPr>
+        <w:t>(Done</w:t>
+      </w:r>
+      <w:r>
+        <w:rPr>
+          <w:rFonts w:ascii="Times New Roman" w:eastAsia="Times New Roman" w:hAnsi="Times New Roman" w:cs="Times New Roman"/>
+          <w:b/>
+          <w:bCs/>
+          <w:kern w:val="36"/>
+          <w:sz w:val="48"/>
+          <w:szCs w:val="48"/>
+          <w:highlight w:val="yellow"/>
+          <w:lang w:eastAsia="en-IN"/>
+        </w:rPr>
+        <w:t xml:space="preserve"> for Home Page</w:t>
+      </w:r>
+      <w:r>
+        <w:rPr>
+          <w:rFonts w:ascii="Times New Roman" w:eastAsia="Times New Roman" w:hAnsi="Times New Roman" w:cs="Times New Roman"/>
+          <w:b/>
+          <w:bCs/>
+          <w:kern w:val="36"/>
+          <w:sz w:val="48"/>
+          <w:szCs w:val="48"/>
+          <w:highlight w:val="yellow"/>
+          <w:lang w:eastAsia="en-IN"/>
+        </w:rPr>
+        <w:t>)</w:t>
+      </w:r>
     </w:p>
     <w:p>
       <w:pPr>
@@ -8942,8 +9017,6 @@
         </w:rPr>
         <w:t>(Done)</w:t>
       </w:r>
-      <w:bookmarkStart w:id="0" w:name="_GoBack"/>
-      <w:bookmarkEnd w:id="0"/>
     </w:p>
     <w:p>
       <w:pPr>
@@ -10325,6 +10398,81 @@
         </w:rPr>
         <w:t>14. Why Soul IT Networks?</w:t>
       </w:r>
+      <w:r>
+        <w:rPr>
+          <w:rFonts w:ascii="Times New Roman" w:eastAsia="Times New Roman" w:hAnsi="Times New Roman" w:cs="Times New Roman"/>
+          <w:b/>
+          <w:bCs/>
+          <w:kern w:val="36"/>
+          <w:sz w:val="48"/>
+          <w:szCs w:val="48"/>
+          <w:lang w:eastAsia="en-IN"/>
+        </w:rPr>
+        <w:t xml:space="preserve"> </w:t>
+      </w:r>
+      <w:r>
+        <w:rPr>
+          <w:rFonts w:ascii="Times New Roman" w:eastAsia="Times New Roman" w:hAnsi="Times New Roman" w:cs="Times New Roman"/>
+          <w:b/>
+          <w:bCs/>
+          <w:kern w:val="36"/>
+          <w:sz w:val="48"/>
+          <w:szCs w:val="48"/>
+          <w:lang w:eastAsia="en-IN"/>
+        </w:rPr>
+        <w:sym w:font="Wingdings" w:char="F0E0"/>
+      </w:r>
+      <w:r>
+        <w:rPr>
+          <w:rFonts w:ascii="Times New Roman" w:eastAsia="Times New Roman" w:hAnsi="Times New Roman" w:cs="Times New Roman"/>
+          <w:b/>
+          <w:bCs/>
+          <w:kern w:val="36"/>
+          <w:sz w:val="48"/>
+          <w:szCs w:val="48"/>
+          <w:lang w:eastAsia="en-IN"/>
+        </w:rPr>
+        <w:t xml:space="preserve"> </w:t>
+      </w:r>
+      <w:r>
+        <w:rPr>
+          <w:rFonts w:ascii="Times New Roman" w:eastAsia="Times New Roman" w:hAnsi="Times New Roman" w:cs="Times New Roman"/>
+          <w:b/>
+          <w:bCs/>
+          <w:kern w:val="36"/>
+          <w:sz w:val="48"/>
+          <w:szCs w:val="48"/>
+          <w:highlight w:val="yellow"/>
+          <w:lang w:eastAsia="en-IN"/>
+        </w:rPr>
+        <w:t>(Done</w:t>
+      </w:r>
+      <w:r>
+        <w:rPr>
+          <w:rFonts w:ascii="Times New Roman" w:eastAsia="Times New Roman" w:hAnsi="Times New Roman" w:cs="Times New Roman"/>
+          <w:b/>
+          <w:bCs/>
+          <w:kern w:val="36"/>
+          <w:sz w:val="48"/>
+          <w:szCs w:val="48"/>
+          <w:highlight w:val="yellow"/>
+          <w:lang w:eastAsia="en-IN"/>
+        </w:rPr>
+        <w:t xml:space="preserve"> for Home Page</w:t>
+      </w:r>
+      <w:r>
+        <w:rPr>
+          <w:rFonts w:ascii="Times New Roman" w:eastAsia="Times New Roman" w:hAnsi="Times New Roman" w:cs="Times New Roman"/>
+          <w:b/>
+          <w:bCs/>
+          <w:kern w:val="36"/>
+          <w:sz w:val="48"/>
+          <w:szCs w:val="48"/>
+          <w:highlight w:val="yellow"/>
+          <w:lang w:eastAsia="en-IN"/>
+        </w:rPr>
+        <w:t>)</w:t>
+      </w:r>
     </w:p>
     <w:p>
       <w:pPr>
@@ -10407,7 +10555,18 @@
           <w:szCs w:val="24"/>
           <w:lang w:eastAsia="en-IN"/>
         </w:rPr>
-        <w:t xml:space="preserve">Incorporated technology company with established statutory credentials </w:t>
+        <w:t>Incorporated technology company with established statuto</w:t>
+      </w:r>
+      <w:bookmarkStart w:id="0" w:name="_GoBack"/>
+      <w:bookmarkEnd w:id="0"/>
+      <w:r>
+        <w:rPr>
+          <w:rFonts w:ascii="Times New Roman" w:eastAsia="Times New Roman" w:hAnsi="Times New Roman" w:cs="Times New Roman"/>
+          <w:sz w:val="24"/>
+          <w:szCs w:val="24"/>
+          <w:lang w:eastAsia="en-IN"/>
+        </w:rPr>
+        <w:t xml:space="preserve">ry credentials </w:t>
       </w:r>
     </w:p>
     <w:p>
@@ -10735,6 +10894,7 @@
           <w:szCs w:val="24"/>
           <w:lang w:eastAsia="en-IN"/>
         </w:rPr>
+        <w:lastRenderedPageBreak/>
         <w:pict>
           <v:rect id="_x0000_i1047" style="width:0;height:1.5pt" o:hralign="center" o:hrstd="t" o:hr="t" fillcolor="#a0a0a0" stroked="f"/>
         </w:pict>
@@ -10764,7 +10924,6 @@
           <w:szCs w:val="48"/>
           <w:lang w:eastAsia="en-IN"/>
         </w:rPr>
-        <w:lastRenderedPageBreak/>
         <w:t>15. Statutory &amp; Corporate Credentials</w:t>
       </w:r>
     </w:p>
@@ -14589,6 +14748,7 @@
   <w:style w:type="paragraph" w:default="1" w:styleId="Normal">
     <w:name w:val="Normal"/>
     <w:qFormat/>
+    <w:rsid w:val="00F336B3"/>
   </w:style>
   <w:style w:type="paragraph" w:styleId="Heading1">
     <w:name w:val="heading 1"/>

</xml_diff>